<commit_message>
Ajout de la correction de l'exercice
Co-Authored-By: Claude Opus 5.5 <noreply@anthropic.com>
Claude-Session: https://claude.ai/code/session_01MshXTjtgNEf3N7vm2ny7Pw
</commit_message>
<xml_diff>
--- a/Exercice_onde_ressort.docx
+++ b/Exercice_onde_ressort.docx
@@ -486,6 +486,698 @@
         <w:t xml:space="preserve">(0,25pt)</w:t>
       </w:r>
     </w:p>
+    <w:p>
+      <w:r>
+        <w:br w:type="page"/>
+      </w:r>
+    </w:p>
+    <w:p>
+      <w:pPr>
+        <w:spacing w:after="200"/>
+        <w:jc w:val="center"/>
+      </w:pPr>
+      <w:r>
+        <w:rPr>
+          <w:rFonts w:ascii="Times New Roman" w:cs="Times New Roman" w:eastAsia="Times New Roman" w:hAnsi="Times New Roman"/>
+          <w:b/>
+          <w:bCs/>
+          <w:color w:val="1F4E79"/>
+          <w:sz w:val="32"/>
+          <w:szCs w:val="32"/>
+        </w:rPr>
+        <w:t xml:space="preserve">Correction</w:t>
+      </w:r>
+    </w:p>
+    <w:p>
+      <w:pPr>
+        <w:spacing w:after="80" w:before="160"/>
+      </w:pPr>
+      <w:r>
+        <w:rPr>
+          <w:rFonts w:ascii="Times New Roman" w:cs="Times New Roman" w:eastAsia="Times New Roman" w:hAnsi="Times New Roman"/>
+          <w:b/>
+          <w:bCs/>
+          <w:color w:val="1F4E79"/>
+          <w:sz w:val="24"/>
+          <w:szCs w:val="24"/>
+          <w:u w:val="single"/>
+        </w:rPr>
+        <w:t xml:space="preserve">Lecture de la figure 2</w:t>
+      </w:r>
+    </w:p>
+    <w:p>
+      <w:pPr>
+        <w:spacing w:after="80" w:line="300"/>
+      </w:pPr>
+      <w:r>
+        <w:rPr>
+          <w:rFonts w:ascii="Times New Roman" w:cs="Times New Roman" w:eastAsia="Times New Roman" w:hAnsi="Times New Roman"/>
+          <w:sz w:val="24"/>
+          <w:szCs w:val="24"/>
+        </w:rPr>
+        <w:t xml:space="preserve">• Le point M reste immobile jusqu’à l’instant θ = 40 ms : c’est le retard de M par rapport à S.</w:t>
+      </w:r>
+    </w:p>
+    <w:p>
+      <w:pPr>
+        <w:spacing w:after="80" w:line="300"/>
+      </w:pPr>
+      <w:r>
+        <w:rPr>
+          <w:rFonts w:ascii="Times New Roman" w:cs="Times New Roman" w:eastAsia="Times New Roman" w:hAnsi="Times New Roman"/>
+          <w:sz w:val="24"/>
+          <w:szCs w:val="24"/>
+        </w:rPr>
+        <w:t xml:space="preserve">• Ensuite x</w:t>
+      </w:r>
+      <w:r>
+        <w:rPr>
+          <w:rFonts w:ascii="Times New Roman" w:cs="Times New Roman" w:eastAsia="Times New Roman" w:hAnsi="Times New Roman"/>
+          <w:sz w:val="24"/>
+          <w:szCs w:val="24"/>
+          <w:vertAlign w:val="subscript"/>
+        </w:rPr>
+        <w:t xml:space="preserve">M</w:t>
+      </w:r>
+      <w:r>
+        <w:rPr>
+          <w:rFonts w:ascii="Times New Roman" w:cs="Times New Roman" w:eastAsia="Times New Roman" w:hAnsi="Times New Roman"/>
+          <w:sz w:val="24"/>
+          <w:szCs w:val="24"/>
+        </w:rPr>
+        <w:t xml:space="preserve">(t) est sinusoïdale : une demi-période dure de 40 ms à 60 ms, donc T = 40 ms (f = 1/T = 25 Hz).</w:t>
+      </w:r>
+    </w:p>
+    <w:p>
+      <w:pPr>
+        <w:spacing w:after="80" w:line="300"/>
+      </w:pPr>
+      <w:r>
+        <w:rPr>
+          <w:rFonts w:ascii="Times New Roman" w:cs="Times New Roman" w:eastAsia="Times New Roman" w:hAnsi="Times New Roman"/>
+          <w:sz w:val="24"/>
+          <w:szCs w:val="24"/>
+        </w:rPr>
+        <w:t xml:space="preserve">• Amplitude : X</w:t>
+      </w:r>
+      <w:r>
+        <w:rPr>
+          <w:rFonts w:ascii="Times New Roman" w:cs="Times New Roman" w:eastAsia="Times New Roman" w:hAnsi="Times New Roman"/>
+          <w:sz w:val="24"/>
+          <w:szCs w:val="24"/>
+          <w:vertAlign w:val="subscript"/>
+        </w:rPr>
+        <w:t xml:space="preserve">m</w:t>
+      </w:r>
+      <w:r>
+        <w:rPr>
+          <w:rFonts w:ascii="Times New Roman" w:cs="Times New Roman" w:eastAsia="Times New Roman" w:hAnsi="Times New Roman"/>
+          <w:sz w:val="24"/>
+          <w:szCs w:val="24"/>
+        </w:rPr>
+        <w:t xml:space="preserve"> = 5 mm. M commence son mouvement vers les élongations négatives.</w:t>
+      </w:r>
+    </w:p>
+    <w:p>
+      <w:pPr>
+        <w:spacing w:after="80" w:before="160"/>
+      </w:pPr>
+      <w:r>
+        <w:rPr>
+          <w:rFonts w:ascii="Times New Roman" w:cs="Times New Roman" w:eastAsia="Times New Roman" w:hAnsi="Times New Roman"/>
+          <w:b/>
+          <w:bCs/>
+          <w:color w:val="1F4E79"/>
+          <w:sz w:val="24"/>
+          <w:szCs w:val="24"/>
+          <w:u w:val="single"/>
+        </w:rPr>
+        <w:t xml:space="preserve">1- Affirmations</w:t>
+      </w:r>
+    </w:p>
+    <w:p>
+      <w:pPr>
+        <w:spacing w:after="80" w:line="300"/>
+      </w:pPr>
+      <w:r>
+        <w:rPr>
+          <w:rFonts w:ascii="Times New Roman" w:cs="Times New Roman" w:eastAsia="Times New Roman" w:hAnsi="Times New Roman"/>
+          <w:b/>
+          <w:bCs/>
+          <w:sz w:val="24"/>
+          <w:szCs w:val="24"/>
+        </w:rPr>
+        <w:t xml:space="preserve">a- Juste : </w:t>
+      </w:r>
+      <w:r>
+        <w:rPr>
+          <w:rFonts w:ascii="Times New Roman" w:cs="Times New Roman" w:eastAsia="Times New Roman" w:hAnsi="Times New Roman"/>
+          <w:sz w:val="24"/>
+          <w:szCs w:val="24"/>
+        </w:rPr>
+        <w:t xml:space="preserve">l’onde est mécanique (elle se propage dans un milieu matériel) et progressive.</w:t>
+      </w:r>
+    </w:p>
+    <w:p>
+      <w:pPr>
+        <w:spacing w:after="80" w:line="300"/>
+      </w:pPr>
+      <w:r>
+        <w:rPr>
+          <w:rFonts w:ascii="Times New Roman" w:cs="Times New Roman" w:eastAsia="Times New Roman" w:hAnsi="Times New Roman"/>
+          <w:b/>
+          <w:bCs/>
+          <w:sz w:val="24"/>
+          <w:szCs w:val="24"/>
+        </w:rPr>
+        <w:t xml:space="preserve">b- Fausse : </w:t>
+      </w:r>
+      <w:r>
+        <w:rPr>
+          <w:rFonts w:ascii="Times New Roman" w:cs="Times New Roman" w:eastAsia="Times New Roman" w:hAnsi="Times New Roman"/>
+          <w:sz w:val="24"/>
+          <w:szCs w:val="24"/>
+        </w:rPr>
+        <w:t xml:space="preserve">la déformation (compression des spires) est parallèle à la direction de propagation, donc l’onde est longitudinale.</w:t>
+      </w:r>
+    </w:p>
+    <w:p>
+      <w:pPr>
+        <w:spacing w:after="80" w:line="300"/>
+      </w:pPr>
+      <w:r>
+        <w:rPr>
+          <w:rFonts w:ascii="Times New Roman" w:cs="Times New Roman" w:eastAsia="Times New Roman" w:hAnsi="Times New Roman"/>
+          <w:b/>
+          <w:bCs/>
+          <w:sz w:val="24"/>
+          <w:szCs w:val="24"/>
+        </w:rPr>
+        <w:t xml:space="preserve">c- Fausse : </w:t>
+      </w:r>
+      <w:r>
+        <w:rPr>
+          <w:rFonts w:ascii="Times New Roman" w:cs="Times New Roman" w:eastAsia="Times New Roman" w:hAnsi="Times New Roman"/>
+          <w:sz w:val="24"/>
+          <w:szCs w:val="24"/>
+        </w:rPr>
+        <w:t xml:space="preserve">une onde transporte de l’énergie sans transport de matière.</w:t>
+      </w:r>
+    </w:p>
+    <w:p>
+      <w:pPr>
+        <w:spacing w:after="80" w:line="300"/>
+      </w:pPr>
+      <w:r>
+        <w:rPr>
+          <w:rFonts w:ascii="Times New Roman" w:cs="Times New Roman" w:eastAsia="Times New Roman" w:hAnsi="Times New Roman"/>
+          <w:b/>
+          <w:bCs/>
+          <w:sz w:val="24"/>
+          <w:szCs w:val="24"/>
+        </w:rPr>
+        <w:t xml:space="preserve">d- Fausse : </w:t>
+      </w:r>
+      <w:r>
+        <w:rPr>
+          <w:rFonts w:ascii="Times New Roman" w:cs="Times New Roman" w:eastAsia="Times New Roman" w:hAnsi="Times New Roman"/>
+          <w:sz w:val="24"/>
+          <w:szCs w:val="24"/>
+        </w:rPr>
+        <w:t xml:space="preserve">un milieu où la célérité ne dépend pas de la fréquence est non dispersif.</w:t>
+      </w:r>
+    </w:p>
+    <w:p>
+      <w:pPr>
+        <w:spacing w:after="120" w:before="60"/>
+      </w:pPr>
+      <w:r>
+        <w:rPr>
+          <w:rFonts w:ascii="Times New Roman" w:cs="Times New Roman" w:eastAsia="Times New Roman" w:hAnsi="Times New Roman"/>
+          <w:sz w:val="24"/>
+          <w:szCs w:val="24"/>
+        </w:rPr>
+        <w:t xml:space="preserve">Nombre d’affirmations justes : </w:t>
+      </w:r>
+      <w:r>
+        <w:rPr>
+          <w:rFonts w:ascii="Times New Roman" w:cs="Times New Roman" w:eastAsia="Times New Roman" w:hAnsi="Times New Roman"/>
+          <w:b/>
+          <w:bCs/>
+          <w:sz w:val="24"/>
+          <w:szCs w:val="24"/>
+        </w:rPr>
+        <w:t xml:space="preserve">1</w:t>
+      </w:r>
+    </w:p>
+    <w:p>
+      <w:pPr>
+        <w:spacing w:after="80" w:before="160"/>
+      </w:pPr>
+      <w:r>
+        <w:rPr>
+          <w:rFonts w:ascii="Times New Roman" w:cs="Times New Roman" w:eastAsia="Times New Roman" w:hAnsi="Times New Roman"/>
+          <w:b/>
+          <w:bCs/>
+          <w:color w:val="1F4E79"/>
+          <w:sz w:val="24"/>
+          <w:szCs w:val="24"/>
+          <w:u w:val="single"/>
+        </w:rPr>
+        <w:t xml:space="preserve">2- Célérité de l’onde</w:t>
+      </w:r>
+    </w:p>
+    <w:p>
+      <w:pPr>
+        <w:spacing w:after="80" w:line="300"/>
+      </w:pPr>
+      <w:r>
+        <w:rPr>
+          <w:rFonts w:ascii="Times New Roman" w:cs="Times New Roman" w:eastAsia="Times New Roman" w:hAnsi="Times New Roman"/>
+          <w:sz w:val="24"/>
+          <w:szCs w:val="24"/>
+        </w:rPr>
+        <w:t xml:space="preserve">v = d / θ = 0,64 / (40 × 10</w:t>
+      </w:r>
+      <w:r>
+        <w:rPr>
+          <w:rFonts w:ascii="Times New Roman" w:cs="Times New Roman" w:eastAsia="Times New Roman" w:hAnsi="Times New Roman"/>
+          <w:sz w:val="24"/>
+          <w:szCs w:val="24"/>
+          <w:vertAlign w:val="superscript"/>
+        </w:rPr>
+        <w:t xml:space="preserve">-3</w:t>
+      </w:r>
+      <w:r>
+        <w:rPr>
+          <w:rFonts w:ascii="Times New Roman" w:cs="Times New Roman" w:eastAsia="Times New Roman" w:hAnsi="Times New Roman"/>
+          <w:sz w:val="24"/>
+          <w:szCs w:val="24"/>
+        </w:rPr>
+        <w:t xml:space="preserve">) ⇒ </w:t>
+      </w:r>
+      <w:r>
+        <w:rPr>
+          <w:rFonts w:ascii="Times New Roman" w:cs="Times New Roman" w:eastAsia="Times New Roman" w:hAnsi="Times New Roman"/>
+          <w:b/>
+          <w:bCs/>
+          <w:sz w:val="24"/>
+          <w:szCs w:val="24"/>
+        </w:rPr>
+        <w:t xml:space="preserve">v = 16 m/s</w:t>
+      </w:r>
+    </w:p>
+    <w:p>
+      <w:pPr>
+        <w:spacing w:after="80" w:before="160"/>
+      </w:pPr>
+      <w:r>
+        <w:rPr>
+          <w:rFonts w:ascii="Times New Roman" w:cs="Times New Roman" w:eastAsia="Times New Roman" w:hAnsi="Times New Roman"/>
+          <w:b/>
+          <w:bCs/>
+          <w:color w:val="1F4E79"/>
+          <w:sz w:val="24"/>
+          <w:szCs w:val="24"/>
+          <w:u w:val="single"/>
+        </w:rPr>
+        <w:t xml:space="preserve">3- Longueur d’onde</w:t>
+      </w:r>
+    </w:p>
+    <w:p>
+      <w:pPr>
+        <w:spacing w:after="80" w:line="300"/>
+      </w:pPr>
+      <w:r>
+        <w:rPr>
+          <w:rFonts w:ascii="Times New Roman" w:cs="Times New Roman" w:eastAsia="Times New Roman" w:hAnsi="Times New Roman"/>
+          <w:sz w:val="24"/>
+          <w:szCs w:val="24"/>
+        </w:rPr>
+        <w:t xml:space="preserve">λ = v · T = 16 × 40 × 10</w:t>
+      </w:r>
+      <w:r>
+        <w:rPr>
+          <w:rFonts w:ascii="Times New Roman" w:cs="Times New Roman" w:eastAsia="Times New Roman" w:hAnsi="Times New Roman"/>
+          <w:sz w:val="24"/>
+          <w:szCs w:val="24"/>
+          <w:vertAlign w:val="superscript"/>
+        </w:rPr>
+        <w:t xml:space="preserve">-3</w:t>
+      </w:r>
+      <w:r>
+        <w:rPr>
+          <w:rFonts w:ascii="Times New Roman" w:cs="Times New Roman" w:eastAsia="Times New Roman" w:hAnsi="Times New Roman"/>
+          <w:sz w:val="24"/>
+          <w:szCs w:val="24"/>
+        </w:rPr>
+        <w:t xml:space="preserve"> ⇒ </w:t>
+      </w:r>
+      <w:r>
+        <w:rPr>
+          <w:rFonts w:ascii="Times New Roman" w:cs="Times New Roman" w:eastAsia="Times New Roman" w:hAnsi="Times New Roman"/>
+          <w:b/>
+          <w:bCs/>
+          <w:sz w:val="24"/>
+          <w:szCs w:val="24"/>
+        </w:rPr>
+        <w:t xml:space="preserve">λ = 0,64 m = 64 cm</w:t>
+      </w:r>
+    </w:p>
+    <w:p>
+      <w:pPr>
+        <w:spacing w:after="80" w:line="300"/>
+      </w:pPr>
+      <w:r>
+        <w:rPr>
+          <w:rFonts w:ascii="Times New Roman" w:cs="Times New Roman" w:eastAsia="Times New Roman" w:hAnsi="Times New Roman"/>
+          <w:sz w:val="24"/>
+          <w:szCs w:val="24"/>
+        </w:rPr>
+        <w:t xml:space="preserve">Remarque : d = λ, donc M vibre en phase avec S.</w:t>
+      </w:r>
+    </w:p>
+    <w:p>
+      <w:pPr>
+        <w:spacing w:after="80" w:before="160"/>
+      </w:pPr>
+      <w:r>
+        <w:rPr>
+          <w:rFonts w:ascii="Times New Roman" w:cs="Times New Roman" w:eastAsia="Times New Roman" w:hAnsi="Times New Roman"/>
+          <w:b/>
+          <w:bCs/>
+          <w:color w:val="1F4E79"/>
+          <w:sz w:val="24"/>
+          <w:szCs w:val="24"/>
+          <w:u w:val="single"/>
+        </w:rPr>
+        <w:t xml:space="preserve">4-1- Élongation x</w:t>
+      </w:r>
+      <w:r>
+        <w:rPr>
+          <w:rFonts w:ascii="Times New Roman" w:cs="Times New Roman" w:eastAsia="Times New Roman" w:hAnsi="Times New Roman"/>
+          <w:b/>
+          <w:bCs/>
+          <w:color w:val="1F4E79"/>
+          <w:sz w:val="24"/>
+          <w:szCs w:val="24"/>
+          <w:u w:val="single"/>
+          <w:vertAlign w:val="subscript"/>
+        </w:rPr>
+        <w:t xml:space="preserve">S</w:t>
+      </w:r>
+      <w:r>
+        <w:rPr>
+          <w:rFonts w:ascii="Times New Roman" w:cs="Times New Roman" w:eastAsia="Times New Roman" w:hAnsi="Times New Roman"/>
+          <w:b/>
+          <w:bCs/>
+          <w:color w:val="1F4E79"/>
+          <w:sz w:val="24"/>
+          <w:szCs w:val="24"/>
+          <w:u w:val="single"/>
+        </w:rPr>
+        <w:t xml:space="preserve">(t) de la source</w:t>
+      </w:r>
+    </w:p>
+    <w:p>
+      <w:pPr>
+        <w:spacing w:after="80" w:line="300"/>
+      </w:pPr>
+      <w:r>
+        <w:rPr>
+          <w:rFonts w:ascii="Times New Roman" w:cs="Times New Roman" w:eastAsia="Times New Roman" w:hAnsi="Times New Roman"/>
+          <w:sz w:val="24"/>
+          <w:szCs w:val="24"/>
+        </w:rPr>
+        <w:t xml:space="preserve">M reproduit le mouvement de S avec le retard θ : x</w:t>
+      </w:r>
+      <w:r>
+        <w:rPr>
+          <w:rFonts w:ascii="Times New Roman" w:cs="Times New Roman" w:eastAsia="Times New Roman" w:hAnsi="Times New Roman"/>
+          <w:sz w:val="24"/>
+          <w:szCs w:val="24"/>
+          <w:vertAlign w:val="subscript"/>
+        </w:rPr>
+        <w:t xml:space="preserve">S</w:t>
+      </w:r>
+      <w:r>
+        <w:rPr>
+          <w:rFonts w:ascii="Times New Roman" w:cs="Times New Roman" w:eastAsia="Times New Roman" w:hAnsi="Times New Roman"/>
+          <w:sz w:val="24"/>
+          <w:szCs w:val="24"/>
+        </w:rPr>
+        <w:t xml:space="preserve">(t) = x</w:t>
+      </w:r>
+      <w:r>
+        <w:rPr>
+          <w:rFonts w:ascii="Times New Roman" w:cs="Times New Roman" w:eastAsia="Times New Roman" w:hAnsi="Times New Roman"/>
+          <w:sz w:val="24"/>
+          <w:szCs w:val="24"/>
+          <w:vertAlign w:val="subscript"/>
+        </w:rPr>
+        <w:t xml:space="preserve">M</w:t>
+      </w:r>
+      <w:r>
+        <w:rPr>
+          <w:rFonts w:ascii="Times New Roman" w:cs="Times New Roman" w:eastAsia="Times New Roman" w:hAnsi="Times New Roman"/>
+          <w:sz w:val="24"/>
+          <w:szCs w:val="24"/>
+        </w:rPr>
+        <w:t xml:space="preserve">(t + θ). La source commence donc à t = 0 en se déplaçant vers les élongations négatives :</w:t>
+      </w:r>
+    </w:p>
+    <w:p>
+      <w:pPr>
+        <w:spacing w:after="80" w:line="300"/>
+        <w:jc w:val="center"/>
+      </w:pPr>
+      <w:r>
+        <w:rPr>
+          <w:rFonts w:ascii="Times New Roman" w:cs="Times New Roman" w:eastAsia="Times New Roman" w:hAnsi="Times New Roman"/>
+          <w:sz w:val="24"/>
+          <w:szCs w:val="24"/>
+        </w:rPr>
+        <w:t xml:space="preserve">x</w:t>
+      </w:r>
+      <w:r>
+        <w:rPr>
+          <w:rFonts w:ascii="Times New Roman" w:cs="Times New Roman" w:eastAsia="Times New Roman" w:hAnsi="Times New Roman"/>
+          <w:sz w:val="24"/>
+          <w:szCs w:val="24"/>
+          <w:vertAlign w:val="subscript"/>
+        </w:rPr>
+        <w:t xml:space="preserve">S</w:t>
+      </w:r>
+      <w:r>
+        <w:rPr>
+          <w:rFonts w:ascii="Times New Roman" w:cs="Times New Roman" w:eastAsia="Times New Roman" w:hAnsi="Times New Roman"/>
+          <w:sz w:val="24"/>
+          <w:szCs w:val="24"/>
+        </w:rPr>
+        <w:t xml:space="preserve">(t) = −5 sin(2πt / T) = −5 sin(50πt)   (x en mm, t en s)</w:t>
+      </w:r>
+    </w:p>
+    <w:p>
+      <w:pPr>
+        <w:jc w:val="center"/>
+      </w:pPr>
+      <w:r>
+        <w:drawing>
+          <wp:inline distT="0" distB="0" distL="0" distR="0">
+            <wp:extent cx="5334000" cy="2133600"/>
+            <wp:effectExtent t="0" r="0" b="0" l="0"/>
+            <wp:docPr id="1" name="" descr="" title=""/>
+            <wp:cNvGraphicFramePr>
+              <a:graphicFrameLocks xmlns:a="http://schemas.openxmlformats.org/drawingml/2006/main" noChangeAspect="1"/>
+            </wp:cNvGraphicFramePr>
+            <a:graphic xmlns:a="http://schemas.openxmlformats.org/drawingml/2006/main">
+              <a:graphicData uri="http://schemas.openxmlformats.org/drawingml/2006/picture">
+                <pic:pic xmlns:pic="http://schemas.openxmlformats.org/drawingml/2006/picture">
+                  <pic:nvPicPr>
+                    <pic:cNvPr id="0" name="" descr=""/>
+                    <pic:cNvPicPr>
+                      <a:picLocks noChangeAspect="1" noChangeArrowheads="1"/>
+                    </pic:cNvPicPr>
+                  </pic:nvPicPr>
+                  <pic:blipFill>
+                    <a:blip r:embed="rId9" cstate="none"/>
+                    <a:srcRect/>
+                    <a:stretch>
+                      <a:fillRect/>
+                    </a:stretch>
+                  </pic:blipFill>
+                  <pic:spPr bwMode="auto">
+                    <a:xfrm>
+                      <a:off x="0" y="0"/>
+                      <a:ext cx="5334000" cy="2133600"/>
+                    </a:xfrm>
+                    <a:prstGeom prst="rect">
+                      <a:avLst/>
+                    </a:prstGeom>
+                  </pic:spPr>
+                </pic:pic>
+              </a:graphicData>
+            </a:graphic>
+          </wp:inline>
+        </w:drawing>
+      </w:r>
+    </w:p>
+    <w:p>
+      <w:pPr>
+        <w:spacing w:after="80" w:line="300"/>
+        <w:jc w:val="center"/>
+      </w:pPr>
+      <w:r>
+        <w:rPr>
+          <w:rFonts w:ascii="Times New Roman" w:cs="Times New Roman" w:eastAsia="Times New Roman" w:hAnsi="Times New Roman"/>
+          <w:sz w:val="24"/>
+          <w:szCs w:val="24"/>
+        </w:rPr>
+        <w:t xml:space="preserve">Représentation de x</w:t>
+      </w:r>
+      <w:r>
+        <w:rPr>
+          <w:rFonts w:ascii="Times New Roman" w:cs="Times New Roman" w:eastAsia="Times New Roman" w:hAnsi="Times New Roman"/>
+          <w:sz w:val="24"/>
+          <w:szCs w:val="24"/>
+          <w:vertAlign w:val="subscript"/>
+        </w:rPr>
+        <w:t xml:space="preserve">S</w:t>
+      </w:r>
+      <w:r>
+        <w:rPr>
+          <w:rFonts w:ascii="Times New Roman" w:cs="Times New Roman" w:eastAsia="Times New Roman" w:hAnsi="Times New Roman"/>
+          <w:sz w:val="24"/>
+          <w:szCs w:val="24"/>
+        </w:rPr>
+        <w:t xml:space="preserve">(t) pendant deux périodes (0 ≤ t ≤ 80 ms).</w:t>
+      </w:r>
+    </w:p>
+    <w:p>
+      <w:pPr>
+        <w:spacing w:after="80" w:before="160"/>
+      </w:pPr>
+      <w:r>
+        <w:rPr>
+          <w:rFonts w:ascii="Times New Roman" w:cs="Times New Roman" w:eastAsia="Times New Roman" w:hAnsi="Times New Roman"/>
+          <w:b/>
+          <w:bCs/>
+          <w:color w:val="1F4E79"/>
+          <w:sz w:val="24"/>
+          <w:szCs w:val="24"/>
+          <w:u w:val="single"/>
+        </w:rPr>
+        <w:t xml:space="preserve">4-2- Élongation de S à t = 90 ms</w:t>
+      </w:r>
+    </w:p>
+    <w:p>
+      <w:pPr>
+        <w:spacing w:after="80" w:line="300"/>
+      </w:pPr>
+      <w:r>
+        <w:rPr>
+          <w:rFonts w:ascii="Times New Roman" w:cs="Times New Roman" w:eastAsia="Times New Roman" w:hAnsi="Times New Roman"/>
+          <w:sz w:val="24"/>
+          <w:szCs w:val="24"/>
+        </w:rPr>
+        <w:t xml:space="preserve">x</w:t>
+      </w:r>
+      <w:r>
+        <w:rPr>
+          <w:rFonts w:ascii="Times New Roman" w:cs="Times New Roman" w:eastAsia="Times New Roman" w:hAnsi="Times New Roman"/>
+          <w:sz w:val="24"/>
+          <w:szCs w:val="24"/>
+          <w:vertAlign w:val="subscript"/>
+        </w:rPr>
+        <w:t xml:space="preserve">S</w:t>
+      </w:r>
+      <w:r>
+        <w:rPr>
+          <w:rFonts w:ascii="Times New Roman" w:cs="Times New Roman" w:eastAsia="Times New Roman" w:hAnsi="Times New Roman"/>
+          <w:sz w:val="24"/>
+          <w:szCs w:val="24"/>
+        </w:rPr>
+        <w:t xml:space="preserve">(90 ms) = −5 sin(2π × 90 / 40) = −5 sin(4,5π) = −5 sin(π/2) ⇒ </w:t>
+      </w:r>
+      <w:r>
+        <w:rPr>
+          <w:rFonts w:ascii="Times New Roman" w:cs="Times New Roman" w:eastAsia="Times New Roman" w:hAnsi="Times New Roman"/>
+          <w:b/>
+          <w:bCs/>
+          <w:sz w:val="24"/>
+          <w:szCs w:val="24"/>
+        </w:rPr>
+        <w:t xml:space="preserve">x</w:t>
+      </w:r>
+      <w:r>
+        <w:rPr>
+          <w:rFonts w:ascii="Times New Roman" w:cs="Times New Roman" w:eastAsia="Times New Roman" w:hAnsi="Times New Roman"/>
+          <w:b/>
+          <w:bCs/>
+          <w:sz w:val="24"/>
+          <w:szCs w:val="24"/>
+          <w:vertAlign w:val="subscript"/>
+        </w:rPr>
+        <w:t xml:space="preserve">S</w:t>
+      </w:r>
+      <w:r>
+        <w:rPr>
+          <w:rFonts w:ascii="Times New Roman" w:cs="Times New Roman" w:eastAsia="Times New Roman" w:hAnsi="Times New Roman"/>
+          <w:b/>
+          <w:bCs/>
+          <w:sz w:val="24"/>
+          <w:szCs w:val="24"/>
+        </w:rPr>
+        <w:t xml:space="preserve">(90 ms) = −5 mm</w:t>
+      </w:r>
+    </w:p>
+    <w:p>
+      <w:pPr>
+        <w:spacing w:after="80" w:line="300"/>
+      </w:pPr>
+      <w:r>
+        <w:rPr>
+          <w:rFonts w:ascii="Times New Roman" w:cs="Times New Roman" w:eastAsia="Times New Roman" w:hAnsi="Times New Roman"/>
+          <w:sz w:val="24"/>
+          <w:szCs w:val="24"/>
+        </w:rPr>
+        <w:t xml:space="preserve">Vérification : x</w:t>
+      </w:r>
+      <w:r>
+        <w:rPr>
+          <w:rFonts w:ascii="Times New Roman" w:cs="Times New Roman" w:eastAsia="Times New Roman" w:hAnsi="Times New Roman"/>
+          <w:sz w:val="24"/>
+          <w:szCs w:val="24"/>
+          <w:vertAlign w:val="subscript"/>
+        </w:rPr>
+        <w:t xml:space="preserve">S</w:t>
+      </w:r>
+      <w:r>
+        <w:rPr>
+          <w:rFonts w:ascii="Times New Roman" w:cs="Times New Roman" w:eastAsia="Times New Roman" w:hAnsi="Times New Roman"/>
+          <w:sz w:val="24"/>
+          <w:szCs w:val="24"/>
+        </w:rPr>
+        <w:t xml:space="preserve">(90 ms) = x</w:t>
+      </w:r>
+      <w:r>
+        <w:rPr>
+          <w:rFonts w:ascii="Times New Roman" w:cs="Times New Roman" w:eastAsia="Times New Roman" w:hAnsi="Times New Roman"/>
+          <w:sz w:val="24"/>
+          <w:szCs w:val="24"/>
+          <w:vertAlign w:val="subscript"/>
+        </w:rPr>
+        <w:t xml:space="preserve">M</w:t>
+      </w:r>
+      <w:r>
+        <w:rPr>
+          <w:rFonts w:ascii="Times New Roman" w:cs="Times New Roman" w:eastAsia="Times New Roman" w:hAnsi="Times New Roman"/>
+          <w:sz w:val="24"/>
+          <w:szCs w:val="24"/>
+        </w:rPr>
+        <w:t xml:space="preserve">(130 ms) = −5 mm (minimum sur la figure 2).</w:t>
+      </w:r>
+    </w:p>
     <w:sectPr>
       <w:pgSz w:w="11906" w:h="16838" w:orient="portrait"/>
       <w:pgMar w:top="1134" w:right="1134" w:bottom="1134" w:left="1134" w:header="708" w:footer="708" w:gutter="0"/>

</xml_diff>